<commit_message>
Adopter BV_2.docx/BVC_2.docx pour la génération des arrêtés
Régénère les deux templates docxtpl (bureau_ordinaire.docx,
bureau_central.docx) depuis les nouveaux modèles officiels BV_2.docx et
BVC_2.docx : mêmes champs dynamiques (nom, CIN, numéros, commune,
adresse, membres/suppléants titulaires et suppléants) que la révision
précédente, mais visas, articles et ponctuation repris à l'identique
du nouveau fichier officiel. L'en-tête « قرار عاملي رقم .........../2026 »
reste strictement statique (aucun placeholder, texte intact) dans les
deux modèles. Un artefact de saisie isolé dans BVC_2.docx (un "…" orphelin
avant le blanc du vice-président du bureau central) est normalisé pour ne
pas apparaître dans le document généré, sans toucher au reste du texte.

Co-Authored-By: Claude Sonnet 5 <noreply@anthropic.com>
Claude-Session: https://claude.ai/code/session_01BaHmc9DmpkAm6mxW2kYeWD
</commit_message>
<xml_diff>
--- a/backend/app/templates_word/bureau_central.docx
+++ b/backend/app/templates_word/bureau_central.docx
@@ -371,16 +371,26 @@
           <w:u w:val="single"/>
           <w:rtl/>
         </w:rPr>
-        <w:t>الفصل الأول</w:t>
-      </w:r>
-      <w:r>
-        <w:rPr>
-          <w:rFonts w:ascii="Sakkal Majalla" w:hAnsi="Sakkal Majalla" w:cs="Sakkal Majalla"/>
-          <w:sz w:val="28"/>
-          <w:szCs w:val="28"/>
-          <w:rtl/>
-        </w:rPr>
-        <w:t xml:space="preserve"> :</w:t>
+        <w:t xml:space="preserve">الفصل </w:t>
+      </w:r>
+      <w:r>
+        <w:rPr>
+          <w:rFonts w:ascii="Sakkal Majalla" w:hAnsi="Sakkal Majalla" w:cs="Sakkal Majalla" w:hint="cs"/>
+          <w:sz w:val="28"/>
+          <w:szCs w:val="28"/>
+          <w:u w:val="single"/>
+          <w:rtl/>
+        </w:rPr>
+        <w:t>الأول</w:t>
+      </w:r>
+      <w:r>
+        <w:rPr>
+          <w:rFonts w:ascii="Sakkal Majalla" w:hAnsi="Sakkal Majalla" w:cs="Sakkal Majalla" w:hint="cs"/>
+          <w:sz w:val="28"/>
+          <w:szCs w:val="28"/>
+          <w:rtl/>
+        </w:rPr>
+        <w:t>:</w:t>
       </w:r>
     </w:p>
     <w:p>
@@ -396,16 +406,18 @@
           <w:rtl/>
         </w:rPr>
       </w:pPr>
-      <w:r>
-        <w:rPr>
-          <w:rFonts w:ascii="Sakkal Majalla" w:hAnsi="Sakkal Majalla" w:cs="Sakkal Majalla"/>
-          <w:b w:val="0"/>
-          <w:bCs w:val="0"/>
-          <w:sz w:val="28"/>
-          <w:szCs w:val="28"/>
-          <w:rtl/>
-        </w:rPr>
-        <w:t>يعين السيد (ة) :</w:t>
+      <w:proofErr w:type="gramStart"/>
+      <w:proofErr w:type="gramEnd"/>
+      <w:r>
+        <w:rPr>
+          <w:rFonts w:ascii="Sakkal Majalla" w:hAnsi="Sakkal Majalla" w:cs="Sakkal Majalla"/>
+          <w:b w:val="0"/>
+          <w:bCs w:val="0"/>
+          <w:sz w:val="28"/>
+          <w:szCs w:val="28"/>
+          <w:rtl/>
+        </w:rPr>
+        <w:t xml:space="preserve">يعين السيد (ة) : </w:t>
       </w:r>
       <w:r>
         <w:rPr>
@@ -527,7 +539,17 @@
           <w:u w:val="single"/>
           <w:rtl/>
         </w:rPr>
-        <w:t>الفصل الثاني :</w:t>
+        <w:t xml:space="preserve">الفصل </w:t>
+      </w:r>
+      <w:r>
+        <w:rPr>
+          <w:rFonts w:ascii="Sakkal Majalla" w:hAnsi="Sakkal Majalla" w:cs="Sakkal Majalla" w:hint="cs"/>
+          <w:sz w:val="28"/>
+          <w:szCs w:val="28"/>
+          <w:u w:val="single"/>
+          <w:rtl/>
+        </w:rPr>
+        <w:t>الثاني:</w:t>
       </w:r>
     </w:p>
     <w:p>
@@ -543,6 +565,8 @@
           <w:rtl/>
         </w:rPr>
       </w:pPr>
+      <w:proofErr w:type="gramStart"/>
+      <w:proofErr w:type="gramEnd"/>
       <w:r>
         <w:rPr>
           <w:rFonts w:ascii="Sakkal Majalla" w:hAnsi="Sakkal Majalla" w:cs="Sakkal Majalla"/>
@@ -619,7 +643,17 @@
           <w:u w:val="single"/>
           <w:rtl/>
         </w:rPr>
-        <w:t>الفصل الثالث :</w:t>
+        <w:t xml:space="preserve">الفصل </w:t>
+      </w:r>
+      <w:r>
+        <w:rPr>
+          <w:rFonts w:ascii="Sakkal Majalla" w:hAnsi="Sakkal Majalla" w:cs="Sakkal Majalla" w:hint="cs"/>
+          <w:sz w:val="28"/>
+          <w:szCs w:val="28"/>
+          <w:u w:val="single"/>
+          <w:rtl/>
+        </w:rPr>
+        <w:t>الثالث:</w:t>
       </w:r>
     </w:p>
     <w:p>
@@ -745,7 +779,7 @@
           <w:rtl/>
           <w:lang w:val="fr-MA"/>
         </w:rPr>
-        <w:t>،؛</w:t>
+        <w:t>،</w:t>
       </w:r>
     </w:p>
     <w:p>
@@ -824,7 +858,7 @@
           <w:rtl/>
           <w:lang w:val="fr-MA"/>
         </w:rPr>
-        <w:t>،؛</w:t>
+        <w:t>،</w:t>
       </w:r>
     </w:p>
     <w:p>
@@ -903,7 +937,7 @@
           <w:rtl/>
           <w:lang w:val="fr-MA"/>
         </w:rPr>
-        <w:t>،؛</w:t>
+        <w:t>،</w:t>
       </w:r>
     </w:p>
     <w:p>
@@ -926,7 +960,17 @@
           <w:u w:val="single"/>
           <w:rtl/>
         </w:rPr>
-        <w:t>الفصل الرابع :</w:t>
+        <w:t xml:space="preserve">الفصل </w:t>
+      </w:r>
+      <w:r>
+        <w:rPr>
+          <w:rFonts w:ascii="Sakkal Majalla" w:hAnsi="Sakkal Majalla" w:cs="Sakkal Majalla" w:hint="cs"/>
+          <w:sz w:val="28"/>
+          <w:szCs w:val="28"/>
+          <w:u w:val="single"/>
+          <w:rtl/>
+        </w:rPr>
+        <w:t>الرابع:</w:t>
       </w:r>
     </w:p>
     <w:p>
@@ -1047,7 +1091,7 @@
           <w:szCs w:val="28"/>
           <w:rtl/>
         </w:rPr>
-        <w:t>،؛</w:t>
+        <w:t>،</w:t>
       </w:r>
     </w:p>
     <w:p>
@@ -1121,7 +1165,7 @@
           <w:szCs w:val="28"/>
           <w:rtl/>
         </w:rPr>
-        <w:t>،؛</w:t>
+        <w:t>،</w:t>
       </w:r>
     </w:p>
     <w:p>
@@ -1138,7 +1182,6 @@
           <w:bCs w:val="0"/>
           <w:sz w:val="28"/>
           <w:szCs w:val="28"/>
-          <w:rtl/>
           <w:lang w:val="fr-MA"/>
         </w:rPr>
       </w:pPr>
@@ -1195,8 +1238,25 @@
           <w:szCs w:val="28"/>
           <w:rtl/>
         </w:rPr>
-        <w:t>،؛</w:t>
-      </w:r>
+        <w:t>،</w:t>
+      </w:r>
+    </w:p>
+    <w:p>
+      <w:pPr>
+        <w:tabs>
+          <w:tab w:val="right" w:pos="9341"/>
+        </w:tabs>
+        <w:bidi/>
+        <w:spacing w:after="0" w:line="240" w:lineRule="auto"/>
+        <w:ind w:left="-808" w:firstLine="808"/>
+        <w:jc w:val="right"/>
+        <w:rPr>
+          <w:rFonts w:ascii="Andalus" w:eastAsia="Times New Roman" w:hAnsi="Andalus" w:cs="Andalus"/>
+          <w:sz w:val="26"/>
+          <w:szCs w:val="26"/>
+          <w:lang w:bidi="ar-MA"/>
+        </w:rPr>
+      </w:pPr>
     </w:p>
     <w:p>
       <w:pPr>
@@ -1215,25 +1275,37 @@
       </w:pPr>
       <w:r>
         <w:rPr>
-          <w:rFonts w:ascii="Sakkal Majalla" w:hAnsi="Sakkal Majalla" w:cs="Sakkal Majalla"/>
-          <w:sz w:val="28"/>
-          <w:szCs w:val="28"/>
-          <w:rtl/>
+          <w:rFonts w:ascii="Andalus" w:eastAsia="Times New Roman" w:hAnsi="Andalus" w:cs="Andalus"/>
+          <w:noProof/>
+          <w:sz w:val="26"/>
+          <w:szCs w:val="26"/>
+          <w:lang w:bidi="ar-MA"/>
         </w:rPr>
         <w:t xml:space="preserve">الداخلة، في: </w:t>
       </w:r>
       <w:r>
         <w:rPr>
-          <w:rFonts w:ascii="Sakkal Majalla" w:hAnsi="Sakkal Majalla" w:cs="Sakkal Majalla"/>
-          <w:sz w:val="28"/>
-          <w:szCs w:val="28"/>
-          <w:rtl/>
+          <w:rFonts w:ascii="Andalus" w:eastAsia="Times New Roman" w:hAnsi="Andalus" w:cs="Andalus"/>
+          <w:noProof/>
+          <w:sz w:val="26"/>
+          <w:szCs w:val="26"/>
+          <w:lang w:bidi="ar-MA"/>
         </w:rPr>
         <w:t>{{ date_signature }}</w:t>
+      </w:r>
+      <w:r>
+        <w:rPr>
+          <w:rFonts w:ascii="Andalus" w:eastAsia="Times New Roman" w:hAnsi="Andalus" w:cs="Andalus"/>
+          <w:noProof/>
+          <w:sz w:val="26"/>
+          <w:szCs w:val="26"/>
+          <w:lang w:bidi="ar-MA"/>
+        </w:rPr>
+        <w:t xml:space="preserve"> </w:t>
       </w:r>
     </w:p>
     <w:sectPr>
-      <w:headerReference w:type="default" r:id="rId8"/>
+      <w:headerReference w:type="default" r:id="rId9"/>
       <w:pgSz w:w="11906" w:h="16838"/>
       <w:pgMar w:top="2268" w:right="1133" w:bottom="426" w:left="993" w:header="709" w:footer="708" w:gutter="0"/>
       <w:pgBorders w:offsetFrom="page">

</xml_diff>

<commit_message>
Fix: le cachet officiel disparaissait du bureau central généré
Dans BVC_2.docx, l'image du cachet est ancrée dans le même run que le
texte "الداخلة، في: ......." (contrairement à BV_2.docx, où elle occupe
un paragraphe séparé) : la régénération du template injectait
date_signature en reconstruisant tous les runs de ce paragraphe,
supprimant le cachet au passage. Le document du bureau central
s'arrêtait donc juste après la date, sans le cachet visible sur celui
du bureau ordinaire.

Le template est régénéré en préservant tout run contenant un
<w:drawing>/<w:pict> à sa position d'origine, en ne reconstruisant que
le texte autour. Ajoute un test de non-régression qui vérifie la
présence d'au moins un <w:drawing> dans les deux documents générés.

Co-Authored-By: Claude Sonnet 5 <noreply@anthropic.com>
Claude-Session: https://claude.ai/code/session_01BaHmc9DmpkAm6mxW2kYeWD
</commit_message>
<xml_diff>
--- a/backend/app/templates_word/bureau_central.docx
+++ b/backend/app/templates_word/bureau_central.docx
@@ -183,7 +183,7 @@
     </w:p>
     <w:p>
       <w:pPr>
-        <w:pStyle w:val="Paragraphedeliste"/>
+        <w:pStyle w:val="ListParagraph"/>
         <w:numPr>
           <w:ilvl w:val="0"/>
           <w:numId w:val="12"/>
@@ -215,7 +215,7 @@
     </w:p>
     <w:p>
       <w:pPr>
-        <w:pStyle w:val="Paragraphedeliste"/>
+        <w:pStyle w:val="ListParagraph"/>
         <w:numPr>
           <w:ilvl w:val="0"/>
           <w:numId w:val="12"/>
@@ -247,7 +247,7 @@
     </w:p>
     <w:p>
       <w:pPr>
-        <w:pStyle w:val="Paragraphedeliste"/>
+        <w:pStyle w:val="ListParagraph"/>
         <w:numPr>
           <w:ilvl w:val="0"/>
           <w:numId w:val="12"/>
@@ -279,7 +279,7 @@
     </w:p>
     <w:p>
       <w:pPr>
-        <w:pStyle w:val="Paragraphedeliste"/>
+        <w:pStyle w:val="ListParagraph"/>
         <w:numPr>
           <w:ilvl w:val="0"/>
           <w:numId w:val="12"/>
@@ -354,7 +354,7 @@
     </w:p>
     <w:p>
       <w:pPr>
-        <w:pStyle w:val="Normalcentr"/>
+        <w:pStyle w:val="BlockText"/>
         <w:ind w:left="26" w:right="0" w:firstLine="0"/>
         <w:rPr>
           <w:rFonts w:ascii="Sakkal Majalla" w:hAnsi="Sakkal Majalla" w:cs="Sakkal Majalla"/>
@@ -395,7 +395,7 @@
     </w:p>
     <w:p>
       <w:pPr>
-        <w:pStyle w:val="Normalcentr"/>
+        <w:pStyle w:val="BlockText"/>
         <w:ind w:left="26" w:right="0" w:firstLine="540"/>
         <w:rPr>
           <w:rFonts w:ascii="Sakkal Majalla" w:hAnsi="Sakkal Majalla" w:cs="Sakkal Majalla"/>
@@ -521,7 +521,7 @@
     </w:p>
     <w:p>
       <w:pPr>
-        <w:pStyle w:val="Normalcentr"/>
+        <w:pStyle w:val="BlockText"/>
         <w:ind w:left="26" w:right="0" w:firstLine="0"/>
         <w:rPr>
           <w:rFonts w:ascii="Sakkal Majalla" w:hAnsi="Sakkal Majalla" w:cs="Sakkal Majalla"/>
@@ -554,7 +554,7 @@
     </w:p>
     <w:p>
       <w:pPr>
-        <w:pStyle w:val="Normalcentr"/>
+        <w:pStyle w:val="BlockText"/>
         <w:ind w:left="26" w:right="0" w:firstLine="540"/>
         <w:rPr>
           <w:rFonts w:ascii="Sakkal Majalla" w:hAnsi="Sakkal Majalla" w:cs="Sakkal Majalla"/>
@@ -625,7 +625,7 @@
     </w:p>
     <w:p>
       <w:pPr>
-        <w:pStyle w:val="Normalcentr"/>
+        <w:pStyle w:val="BlockText"/>
         <w:ind w:left="26" w:right="0" w:firstLine="0"/>
         <w:rPr>
           <w:rFonts w:ascii="Sakkal Majalla" w:hAnsi="Sakkal Majalla" w:cs="Sakkal Majalla"/>
@@ -658,7 +658,7 @@
     </w:p>
     <w:p>
       <w:pPr>
-        <w:pStyle w:val="Normalcentr"/>
+        <w:pStyle w:val="BlockText"/>
         <w:ind w:left="26" w:right="0" w:firstLine="540"/>
         <w:rPr>
           <w:rFonts w:ascii="Sakkal Majalla" w:hAnsi="Sakkal Majalla" w:cs="Sakkal Majalla"/>
@@ -705,7 +705,7 @@
     </w:p>
     <w:p>
       <w:pPr>
-        <w:pStyle w:val="Normalcentr"/>
+        <w:pStyle w:val="BlockText"/>
         <w:numPr>
           <w:ilvl w:val="0"/>
           <w:numId w:val="13"/>
@@ -784,7 +784,7 @@
     </w:p>
     <w:p>
       <w:pPr>
-        <w:pStyle w:val="Normalcentr"/>
+        <w:pStyle w:val="BlockText"/>
         <w:numPr>
           <w:ilvl w:val="0"/>
           <w:numId w:val="13"/>
@@ -863,7 +863,7 @@
     </w:p>
     <w:p>
       <w:pPr>
-        <w:pStyle w:val="Normalcentr"/>
+        <w:pStyle w:val="BlockText"/>
         <w:numPr>
           <w:ilvl w:val="0"/>
           <w:numId w:val="13"/>
@@ -942,7 +942,7 @@
     </w:p>
     <w:p>
       <w:pPr>
-        <w:pStyle w:val="Normalcentr"/>
+        <w:pStyle w:val="BlockText"/>
         <w:ind w:left="26" w:right="0" w:firstLine="0"/>
         <w:rPr>
           <w:rFonts w:ascii="Sakkal Majalla" w:hAnsi="Sakkal Majalla" w:cs="Sakkal Majalla"/>
@@ -975,7 +975,7 @@
     </w:p>
     <w:p>
       <w:pPr>
-        <w:pStyle w:val="Normalcentr"/>
+        <w:pStyle w:val="BlockText"/>
         <w:ind w:left="26" w:right="0" w:firstLine="540"/>
         <w:rPr>
           <w:rFonts w:ascii="Sakkal Majalla" w:hAnsi="Sakkal Majalla" w:cs="Sakkal Majalla"/>
@@ -1022,7 +1022,7 @@
     </w:p>
     <w:p>
       <w:pPr>
-        <w:pStyle w:val="Normalcentr"/>
+        <w:pStyle w:val="BlockText"/>
         <w:numPr>
           <w:ilvl w:val="0"/>
           <w:numId w:val="13"/>
@@ -1096,7 +1096,7 @@
     </w:p>
     <w:p>
       <w:pPr>
-        <w:pStyle w:val="Normalcentr"/>
+        <w:pStyle w:val="BlockText"/>
         <w:numPr>
           <w:ilvl w:val="0"/>
           <w:numId w:val="13"/>
@@ -1170,7 +1170,7 @@
     </w:p>
     <w:p>
       <w:pPr>
-        <w:pStyle w:val="Normalcentr"/>
+        <w:pStyle w:val="BlockText"/>
         <w:numPr>
           <w:ilvl w:val="0"/>
           <w:numId w:val="13"/>
@@ -1281,24 +1281,109 @@
           <w:szCs w:val="26"/>
           <w:lang w:bidi="ar-MA"/>
         </w:rPr>
-        <w:t xml:space="preserve">الداخلة، في: </w:t>
+        <w:drawing>
+          <wp:anchor distT="0" distB="0" distL="114300" distR="114300" simplePos="0" relativeHeight="251662336" behindDoc="1" locked="0" layoutInCell="1" allowOverlap="1" wp14:anchorId="0757730E" wp14:editId="14D9DDC9">
+            <wp:simplePos x="0" y="0"/>
+            <wp:positionH relativeFrom="column">
+              <wp:posOffset>728980</wp:posOffset>
+            </wp:positionH>
+            <wp:positionV relativeFrom="paragraph">
+              <wp:posOffset>280035</wp:posOffset>
+            </wp:positionV>
+            <wp:extent cx="1924050" cy="969645"/>
+            <wp:effectExtent l="0" t="0" r="0" b="0"/>
+            <wp:wrapTight wrapText="bothSides">
+              <wp:wrapPolygon edited="0">
+                <wp:start x="13259" y="1697"/>
+                <wp:lineTo x="11762" y="3395"/>
+                <wp:lineTo x="9410" y="7214"/>
+                <wp:lineTo x="9410" y="9336"/>
+                <wp:lineTo x="0" y="11033"/>
+                <wp:lineTo x="0" y="19096"/>
+                <wp:lineTo x="7485" y="19945"/>
+                <wp:lineTo x="8554" y="19945"/>
+                <wp:lineTo x="14115" y="19096"/>
+                <wp:lineTo x="18606" y="17823"/>
+                <wp:lineTo x="18392" y="16126"/>
+                <wp:lineTo x="21386" y="13580"/>
+                <wp:lineTo x="21386" y="10185"/>
+                <wp:lineTo x="19889" y="9336"/>
+                <wp:lineTo x="20103" y="7639"/>
+                <wp:lineTo x="17750" y="3395"/>
+                <wp:lineTo x="16040" y="1697"/>
+                <wp:lineTo x="13259" y="1697"/>
+              </wp:wrapPolygon>
+            </wp:wrapTight>
+            <wp:docPr id="1736035306" name="Picture 5"/>
+            <wp:cNvGraphicFramePr>
+              <a:graphicFrameLocks xmlns:a="http://schemas.openxmlformats.org/drawingml/2006/main" noChangeAspect="1"/>
+            </wp:cNvGraphicFramePr>
+            <a:graphic xmlns:a="http://schemas.openxmlformats.org/drawingml/2006/main">
+              <a:graphicData uri="http://schemas.openxmlformats.org/drawingml/2006/picture">
+                <pic:pic xmlns:pic="http://schemas.openxmlformats.org/drawingml/2006/picture">
+                  <pic:nvPicPr>
+                    <pic:cNvPr id="1213075650" name="Picture 1213075650"/>
+                    <pic:cNvPicPr/>
+                  </pic:nvPicPr>
+                  <pic:blipFill>
+                    <a:blip r:embed="rId8" cstate="print">
+                      <a:extLst>
+                        <a:ext uri="{28A0092B-C50C-407E-A947-70E740481C1C}">
+                          <a14:useLocalDpi xmlns:a14="http://schemas.microsoft.com/office/drawing/2010/main" val="0"/>
+                        </a:ext>
+                      </a:extLst>
+                    </a:blip>
+                    <a:stretch>
+                      <a:fillRect/>
+                    </a:stretch>
+                  </pic:blipFill>
+                  <pic:spPr>
+                    <a:xfrm>
+                      <a:off x="0" y="0"/>
+                      <a:ext cx="1924050" cy="969645"/>
+                    </a:xfrm>
+                    <a:prstGeom prst="rect">
+                      <a:avLst/>
+                    </a:prstGeom>
+                  </pic:spPr>
+                </pic:pic>
+              </a:graphicData>
+            </a:graphic>
+            <wp14:sizeRelH relativeFrom="margin">
+              <wp14:pctWidth>0</wp14:pctWidth>
+            </wp14:sizeRelH>
+            <wp14:sizeRelV relativeFrom="margin">
+              <wp14:pctHeight>0</wp14:pctHeight>
+            </wp14:sizeRelV>
+          </wp:anchor>
+        </w:drawing>
       </w:r>
       <w:r>
         <w:rPr>
           <w:rFonts w:ascii="Andalus" w:eastAsia="Times New Roman" w:hAnsi="Andalus" w:cs="Andalus"/>
-          <w:noProof/>
           <w:sz w:val="26"/>
           <w:szCs w:val="26"/>
+          <w:rtl/>
           <w:lang w:bidi="ar-MA"/>
         </w:rPr>
-        <w:t>{{ date_signature }}</w:t>
+        <w:t xml:space="preserve">الداخلة، في: </w:t>
       </w:r>
       <w:r>
         <w:rPr>
           <w:rFonts w:ascii="Andalus" w:eastAsia="Times New Roman" w:hAnsi="Andalus" w:cs="Andalus"/>
-          <w:noProof/>
           <w:sz w:val="26"/>
           <w:szCs w:val="26"/>
+          <w:rtl/>
+          <w:lang w:bidi="ar-MA"/>
+        </w:rPr>
+        <w:t>{{ date_signature }}</w:t>
+      </w:r>
+      <w:r>
+        <w:rPr>
+          <w:rFonts w:ascii="Andalus" w:eastAsia="Times New Roman" w:hAnsi="Andalus" w:cs="Andalus"/>
+          <w:sz w:val="26"/>
+          <w:szCs w:val="26"/>
+          <w:rtl/>
           <w:lang w:bidi="ar-MA"/>
         </w:rPr>
         <w:t xml:space="preserve"> </w:t>
@@ -1375,7 +1460,7 @@
 <w:hdr xmlns:wpc="http://schemas.microsoft.com/office/word/2010/wordprocessingCanvas" xmlns:cx="http://schemas.microsoft.com/office/drawing/2014/chartex" xmlns:cx1="http://schemas.microsoft.com/office/drawing/2015/9/8/chartex" xmlns:cx2="http://schemas.microsoft.com/office/drawing/2015/10/21/chartex" xmlns:cx3="http://schemas.microsoft.com/office/drawing/2016/5/9/chartex" xmlns:cx4="http://schemas.microsoft.com/office/drawing/2016/5/10/chartex" xmlns:cx5="http://schemas.microsoft.com/office/drawing/2016/5/11/chartex" xmlns:cx6="http://schemas.microsoft.com/office/drawing/2016/5/12/chartex" xmlns:cx7="http://schemas.microsoft.com/office/drawing/2016/5/13/chartex" xmlns:cx8="http://schemas.microsoft.com/office/drawing/2016/5/14/chartex" xmlns:mc="http://schemas.openxmlformats.org/markup-compatibility/2006" xmlns:aink="http://schemas.microsoft.com/office/drawing/2016/ink" xmlns:am3d="http://schemas.microsoft.com/office/drawing/2017/model3d" xmlns:o="urn:schemas-microsoft-com:office:office" xmlns:oel="http://schemas.microsoft.com/office/2019/extlst" xmlns:r="http://schemas.openxmlformats.org/officeDocument/2006/relationships" xmlns:m="http://schemas.openxmlformats.org/officeDocument/2006/math" xmlns:v="urn:schemas-microsoft-com:vml" xmlns:wp14="http://schemas.microsoft.com/office/word/2010/wordprocessingDrawing" xmlns:wp="http://schemas.openxmlformats.org/drawingml/2006/wordprocessingDrawing" xmlns:w10="urn:schemas-microsoft-com:office:word" xmlns:w="http://schemas.openxmlformats.org/wordprocessingml/2006/main" xmlns:w14="http://schemas.microsoft.com/office/word/2010/wordml" xmlns:w15="http://schemas.microsoft.com/office/word/2012/wordml" xmlns:w16cex="http://schemas.microsoft.com/office/word/2018/wordml/cex" xmlns:w16cid="http://schemas.microsoft.com/office/word/2016/wordml/cid" xmlns:w16="http://schemas.microsoft.com/office/word/2018/wordml" xmlns:w16du="http://schemas.microsoft.com/office/word/2023/wordml/word16du" xmlns:w16sdtdh="http://schemas.microsoft.com/office/word/2020/wordml/sdtdatahash" xmlns:w16sdtfl="http://schemas.microsoft.com/office/word/2024/wordml/sdtformatlock" xmlns:w16se="http://schemas.microsoft.com/office/word/2015/wordml/symex" xmlns:wpg="http://schemas.microsoft.com/office/word/2010/wordprocessingGroup" xmlns:wpi="http://schemas.microsoft.com/office/word/2010/wordprocessingInk" xmlns:wne="http://schemas.microsoft.com/office/word/2006/wordml" xmlns:wps="http://schemas.microsoft.com/office/word/2010/wordprocessingShape" mc:Ignorable="w14 w15 w16se w16cid w16 w16cex w16sdtdh w16sdtfl w16du wp14">
   <w:p>
     <w:pPr>
-      <w:pStyle w:val="En-tte"/>
+      <w:pStyle w:val="Header"/>
       <w:jc w:val="center"/>
     </w:pPr>
     <w:r>
@@ -3873,13 +3958,13 @@
     <w:qFormat/>
     <w:rsid w:val="00925F60"/>
   </w:style>
-  <w:style w:type="character" w:default="1" w:styleId="Policepardfaut">
+  <w:style w:type="character" w:default="1" w:styleId="DefaultParagraphFont">
     <w:name w:val="Default Paragraph Font"/>
     <w:uiPriority w:val="1"/>
     <w:semiHidden/>
     <w:unhideWhenUsed/>
   </w:style>
-  <w:style w:type="table" w:default="1" w:styleId="TableauNormal">
+  <w:style w:type="table" w:default="1" w:styleId="TableNormal">
     <w:name w:val="Normal Table"/>
     <w:uiPriority w:val="99"/>
     <w:semiHidden/>
@@ -3894,15 +3979,15 @@
       </w:tblCellMar>
     </w:tblPr>
   </w:style>
-  <w:style w:type="numbering" w:default="1" w:styleId="Aucuneliste">
+  <w:style w:type="numbering" w:default="1" w:styleId="NoList">
     <w:name w:val="No List"/>
     <w:uiPriority w:val="99"/>
     <w:semiHidden/>
     <w:unhideWhenUsed/>
   </w:style>
-  <w:style w:type="table" w:styleId="Grilledutableau">
+  <w:style w:type="table" w:styleId="TableGrid">
     <w:name w:val="Table Grid"/>
-    <w:basedOn w:val="TableauNormal"/>
+    <w:basedOn w:val="TableNormal"/>
     <w:uiPriority w:val="59"/>
     <w:rsid w:val="00045DC0"/>
     <w:pPr>
@@ -3919,10 +4004,10 @@
       </w:tblBorders>
     </w:tblPr>
   </w:style>
-  <w:style w:type="paragraph" w:styleId="En-tte">
+  <w:style w:type="paragraph" w:styleId="Header">
     <w:name w:val="header"/>
     <w:basedOn w:val="Normal"/>
-    <w:link w:val="En-tteCar"/>
+    <w:link w:val="HeaderChar"/>
     <w:uiPriority w:val="99"/>
     <w:semiHidden/>
     <w:unhideWhenUsed/>
@@ -3935,18 +4020,18 @@
       <w:spacing w:after="0" w:line="240" w:lineRule="auto"/>
     </w:pPr>
   </w:style>
-  <w:style w:type="character" w:customStyle="1" w:styleId="En-tteCar">
-    <w:name w:val="En-tête Car"/>
-    <w:basedOn w:val="Policepardfaut"/>
-    <w:link w:val="En-tte"/>
+  <w:style w:type="character" w:customStyle="1" w:styleId="HeaderChar">
+    <w:name w:val="Header Char"/>
+    <w:basedOn w:val="DefaultParagraphFont"/>
+    <w:link w:val="Header"/>
     <w:uiPriority w:val="99"/>
     <w:semiHidden/>
     <w:rsid w:val="002B4646"/>
   </w:style>
-  <w:style w:type="paragraph" w:styleId="Pieddepage">
+  <w:style w:type="paragraph" w:styleId="Footer">
     <w:name w:val="footer"/>
     <w:basedOn w:val="Normal"/>
-    <w:link w:val="PieddepageCar"/>
+    <w:link w:val="FooterChar"/>
     <w:uiPriority w:val="99"/>
     <w:semiHidden/>
     <w:unhideWhenUsed/>
@@ -3959,15 +4044,15 @@
       <w:spacing w:after="0" w:line="240" w:lineRule="auto"/>
     </w:pPr>
   </w:style>
-  <w:style w:type="character" w:customStyle="1" w:styleId="PieddepageCar">
-    <w:name w:val="Pied de page Car"/>
-    <w:basedOn w:val="Policepardfaut"/>
-    <w:link w:val="Pieddepage"/>
+  <w:style w:type="character" w:customStyle="1" w:styleId="FooterChar">
+    <w:name w:val="Footer Char"/>
+    <w:basedOn w:val="DefaultParagraphFont"/>
+    <w:link w:val="Footer"/>
     <w:uiPriority w:val="99"/>
     <w:semiHidden/>
     <w:rsid w:val="002B4646"/>
   </w:style>
-  <w:style w:type="paragraph" w:styleId="Paragraphedeliste">
+  <w:style w:type="paragraph" w:styleId="ListParagraph">
     <w:name w:val="List Paragraph"/>
     <w:basedOn w:val="Normal"/>
     <w:uiPriority w:val="34"/>
@@ -3978,10 +4063,10 @@
       <w:contextualSpacing/>
     </w:pPr>
   </w:style>
-  <w:style w:type="paragraph" w:styleId="Titre">
+  <w:style w:type="paragraph" w:styleId="Title">
     <w:name w:val="Title"/>
     <w:basedOn w:val="Normal"/>
-    <w:link w:val="TitreCar"/>
+    <w:link w:val="TitleChar"/>
     <w:qFormat/>
     <w:rsid w:val="008F1194"/>
     <w:pPr>
@@ -3999,10 +4084,10 @@
       <w:lang w:bidi="ar-MA"/>
     </w:rPr>
   </w:style>
-  <w:style w:type="character" w:customStyle="1" w:styleId="TitreCar">
-    <w:name w:val="Titre Car"/>
-    <w:basedOn w:val="Policepardfaut"/>
-    <w:link w:val="Titre"/>
+  <w:style w:type="character" w:customStyle="1" w:styleId="TitleChar">
+    <w:name w:val="Title Char"/>
+    <w:basedOn w:val="DefaultParagraphFont"/>
+    <w:link w:val="Title"/>
     <w:rsid w:val="008F1194"/>
     <w:rPr>
       <w:rFonts w:ascii="Times New Roman" w:eastAsia="Times New Roman" w:hAnsi="Times New Roman" w:cs="Traditional Arabic"/>
@@ -4014,10 +4099,10 @@
       <w:lang w:bidi="ar-MA"/>
     </w:rPr>
   </w:style>
-  <w:style w:type="paragraph" w:styleId="Textedebulles">
+  <w:style w:type="paragraph" w:styleId="BalloonText">
     <w:name w:val="Balloon Text"/>
     <w:basedOn w:val="Normal"/>
-    <w:link w:val="TextedebullesCar"/>
+    <w:link w:val="BalloonTextChar"/>
     <w:uiPriority w:val="99"/>
     <w:semiHidden/>
     <w:unhideWhenUsed/>
@@ -4031,10 +4116,10 @@
       <w:szCs w:val="18"/>
     </w:rPr>
   </w:style>
-  <w:style w:type="character" w:customStyle="1" w:styleId="TextedebullesCar">
-    <w:name w:val="Texte de bulles Car"/>
-    <w:basedOn w:val="Policepardfaut"/>
-    <w:link w:val="Textedebulles"/>
+  <w:style w:type="character" w:customStyle="1" w:styleId="BalloonTextChar">
+    <w:name w:val="Balloon Text Char"/>
+    <w:basedOn w:val="DefaultParagraphFont"/>
+    <w:link w:val="BalloonText"/>
     <w:uiPriority w:val="99"/>
     <w:semiHidden/>
     <w:rsid w:val="00724EB2"/>
@@ -4044,9 +4129,9 @@
       <w:szCs w:val="18"/>
     </w:rPr>
   </w:style>
-  <w:style w:type="character" w:styleId="Lienhypertexte">
+  <w:style w:type="character" w:styleId="Hyperlink">
     <w:name w:val="Hyperlink"/>
-    <w:basedOn w:val="Policepardfaut"/>
+    <w:basedOn w:val="DefaultParagraphFont"/>
     <w:uiPriority w:val="99"/>
     <w:semiHidden/>
     <w:unhideWhenUsed/>
@@ -4056,7 +4141,7 @@
       <w:u w:val="single"/>
     </w:rPr>
   </w:style>
-  <w:style w:type="paragraph" w:styleId="Normalcentr">
+  <w:style w:type="paragraph" w:styleId="BlockText">
     <w:name w:val="Block Text"/>
     <w:basedOn w:val="Normal"/>
     <w:rsid w:val="0013093E"/>

</xml_diff>

<commit_message>
Reprendre le cachet amélioré du BVC sur les deux modèles Word
Le dernier BVC.docx agrandit et repositionne le cachet officiel (passé
devant le texte, taille et emplacement ajustés). bureau_central.docx
est régénéré depuis ce fichier ; le même cachet (image, taille et
position identiques) est reporté sur bureau_ordinaire.docx pour que les
deux arrêtés affichent un cachet cohérent.

Co-Authored-By: Claude Sonnet 5 <noreply@anthropic.com>
Claude-Session: https://claude.ai/code/session_01BaHmc9DmpkAm6mxW2kYeWD
</commit_message>
<xml_diff>
--- a/backend/app/templates_word/bureau_central.docx
+++ b/backend/app/templates_word/bureau_central.docx
@@ -1247,23 +1247,6 @@
           <w:tab w:val="right" w:pos="9341"/>
         </w:tabs>
         <w:bidi/>
-        <w:spacing w:after="0" w:line="240" w:lineRule="auto"/>
-        <w:ind w:left="-808" w:firstLine="808"/>
-        <w:jc w:val="right"/>
-        <w:rPr>
-          <w:rFonts w:ascii="Andalus" w:eastAsia="Times New Roman" w:hAnsi="Andalus" w:cs="Andalus"/>
-          <w:sz w:val="26"/>
-          <w:szCs w:val="26"/>
-          <w:lang w:bidi="ar-MA"/>
-        </w:rPr>
-      </w:pPr>
-    </w:p>
-    <w:p>
-      <w:pPr>
-        <w:tabs>
-          <w:tab w:val="right" w:pos="9341"/>
-        </w:tabs>
-        <w:bidi/>
         <w:ind w:left="-808" w:firstLine="808"/>
         <w:jc w:val="right"/>
         <w:rPr>
@@ -1282,39 +1265,18 @@
           <w:lang w:bidi="ar-MA"/>
         </w:rPr>
         <w:drawing>
-          <wp:anchor distT="0" distB="0" distL="114300" distR="114300" simplePos="0" relativeHeight="251662336" behindDoc="1" locked="0" layoutInCell="1" allowOverlap="1" wp14:anchorId="0757730E" wp14:editId="14D9DDC9">
+          <wp:anchor distT="0" distB="0" distL="114300" distR="114300" simplePos="0" relativeHeight="251663360" behindDoc="0" locked="0" layoutInCell="1" allowOverlap="1" wp14:anchorId="754720D2" wp14:editId="11DA3660">
             <wp:simplePos x="0" y="0"/>
             <wp:positionH relativeFrom="column">
-              <wp:posOffset>728980</wp:posOffset>
+              <wp:posOffset>-249555</wp:posOffset>
             </wp:positionH>
             <wp:positionV relativeFrom="paragraph">
-              <wp:posOffset>280035</wp:posOffset>
+              <wp:posOffset>168275</wp:posOffset>
             </wp:positionV>
-            <wp:extent cx="1924050" cy="969645"/>
+            <wp:extent cx="2609850" cy="1412875"/>
             <wp:effectExtent l="0" t="0" r="0" b="0"/>
-            <wp:wrapTight wrapText="bothSides">
-              <wp:wrapPolygon edited="0">
-                <wp:start x="13259" y="1697"/>
-                <wp:lineTo x="11762" y="3395"/>
-                <wp:lineTo x="9410" y="7214"/>
-                <wp:lineTo x="9410" y="9336"/>
-                <wp:lineTo x="0" y="11033"/>
-                <wp:lineTo x="0" y="19096"/>
-                <wp:lineTo x="7485" y="19945"/>
-                <wp:lineTo x="8554" y="19945"/>
-                <wp:lineTo x="14115" y="19096"/>
-                <wp:lineTo x="18606" y="17823"/>
-                <wp:lineTo x="18392" y="16126"/>
-                <wp:lineTo x="21386" y="13580"/>
-                <wp:lineTo x="21386" y="10185"/>
-                <wp:lineTo x="19889" y="9336"/>
-                <wp:lineTo x="20103" y="7639"/>
-                <wp:lineTo x="17750" y="3395"/>
-                <wp:lineTo x="16040" y="1697"/>
-                <wp:lineTo x="13259" y="1697"/>
-              </wp:wrapPolygon>
-            </wp:wrapTight>
-            <wp:docPr id="1736035306" name="Picture 5"/>
+            <wp:wrapNone/>
+            <wp:docPr id="379443928" name="Picture 3"/>
             <wp:cNvGraphicFramePr>
               <a:graphicFrameLocks xmlns:a="http://schemas.openxmlformats.org/drawingml/2006/main" noChangeAspect="1"/>
             </wp:cNvGraphicFramePr>
@@ -1322,11 +1284,11 @@
               <a:graphicData uri="http://schemas.openxmlformats.org/drawingml/2006/picture">
                 <pic:pic xmlns:pic="http://schemas.openxmlformats.org/drawingml/2006/picture">
                   <pic:nvPicPr>
-                    <pic:cNvPr id="1213075650" name="Picture 1213075650"/>
+                    <pic:cNvPr id="379443928" name="Picture 379443928"/>
                     <pic:cNvPicPr/>
                   </pic:nvPicPr>
                   <pic:blipFill>
-                    <a:blip r:embed="rId8" cstate="print">
+                    <a:blip r:embed="rId8">
                       <a:extLst>
                         <a:ext uri="{28A0092B-C50C-407E-A947-70E740481C1C}">
                           <a14:useLocalDpi xmlns:a14="http://schemas.microsoft.com/office/drawing/2010/main" val="0"/>
@@ -1340,7 +1302,7 @@
                   <pic:spPr>
                     <a:xfrm>
                       <a:off x="0" y="0"/>
-                      <a:ext cx="1924050" cy="969645"/>
+                      <a:ext cx="2609850" cy="1412875"/>
                     </a:xfrm>
                     <a:prstGeom prst="rect">
                       <a:avLst/>

</xml_diff>